<commit_message>
Changed as new changes in donor card
</commit_message>
<xml_diff>
--- a/docs/BloodBridge_AI_PRD.docx
+++ b/docs/BloodBridge_AI_PRD.docx
@@ -539,7 +539,7 @@
                 <w:sz w:val="19"/>
                 <w:szCs w:val="19"/>
               </w:rPr>
-              <w:t xml:space="preserve">MVP built and tested. Deployment in progress.</w:t>
+              <w:t xml:space="preserve">MVP built, tested and deployed live.</w:t>
             </w:r>
           </w:p>
         </w:tc>
@@ -650,6 +650,34 @@
           <w:szCs w:val="21"/>
         </w:rPr>
         <w:t xml:space="preserve">Nobody knows who is actually free and medically fit to donate today. A phone number in a list is not the same as an available donor.</w:t>
+      </w:r>
+    </w:p>
+    <w:p>
+      <w:pPr>
+        <w:spacing w:after="120"/>
+      </w:pPr>
+      <w:r>
+        <w:rPr>
+          <w:rFonts w:ascii="Calibri" w:cs="Calibri" w:eastAsia="Calibri" w:hAnsi="Calibri"/>
+          <w:color w:val="1A1A1A"/>
+          <w:sz w:val="21"/>
+          <w:szCs w:val="21"/>
+        </w:rPr>
+        <w:t xml:space="preserve">The scale of the gap is documented. In June 2026 the World Health Organization reported that Pakistan's medical facilities need over 5 million blood donations a year but receive around 2.7 million, an annual deficit of 2.3 million donations. Only 18 percent of those donations are voluntary. The remaining 82 percent come from family or replacement donors, which is exactly the scramble described above.</w:t>
+      </w:r>
+    </w:p>
+    <w:p>
+      <w:pPr>
+        <w:spacing w:after="120"/>
+      </w:pPr>
+      <w:r>
+        <w:rPr>
+          <w:rFonts w:ascii="Calibri" w:cs="Calibri" w:eastAsia="Calibri" w:hAnsi="Calibri"/>
+          <w:color w:val="555555"/>
+          <w:sz w:val="18"/>
+          <w:szCs w:val="18"/>
+        </w:rPr>
+        <w:t xml:space="preserve">Source: WHO EMRO, 16 June 2026. https://www.emro.who.int/pak/pakistan-news/pakistan-faces-an-annual-deficit-of-2-3-million-blood-donations-who-calls-on-voluntary-donors-to-save-lives.html</w:t>
       </w:r>
     </w:p>
     <w:p>
@@ -5514,7 +5542,7 @@
                 <w:sz w:val="19"/>
                 <w:szCs w:val="19"/>
               </w:rPr>
-              <w:t xml:space="preserve">Donor phone numbers stay hidden until the donor accepts</w:t>
+              <w:t xml:space="preserve">Each ranked donor shows area, city, distance and a tap to call number</w:t>
             </w:r>
           </w:p>
         </w:tc>
@@ -5694,6 +5722,210 @@
                 <w:szCs w:val="19"/>
               </w:rPr>
               <w:t xml:space="preserve">FR5.5</w:t>
+            </w:r>
+          </w:p>
+        </w:tc>
+        <w:tc>
+          <w:tcPr>
+            <w:tcW w:type="dxa" w:w="5897"/>
+            <w:tcMar>
+              <w:top w:type="dxa" w:w="70"/>
+              <w:left w:type="dxa" w:w="110"/>
+              <w:bottom w:type="dxa" w:w="70"/>
+              <w:right w:type="dxa" w:w="110"/>
+            </w:tcMar>
+          </w:tcPr>
+          <w:p>
+            <w:pPr>
+              <w:spacing w:after="0"/>
+            </w:pPr>
+            <w:r>
+              <w:rPr>
+                <w:rFonts w:ascii="Calibri" w:cs="Calibri" w:eastAsia="Calibri" w:hAnsi="Calibri"/>
+                <w:color w:val="1A1A1A"/>
+                <w:sz w:val="19"/>
+                <w:szCs w:val="19"/>
+              </w:rPr>
+              <w:t xml:space="preserve">A night mode for use in low light wards</w:t>
+            </w:r>
+          </w:p>
+        </w:tc>
+        <w:tc>
+          <w:tcPr>
+            <w:tcW w:type="dxa" w:w="1123"/>
+            <w:tcMar>
+              <w:top w:type="dxa" w:w="70"/>
+              <w:left w:type="dxa" w:w="110"/>
+              <w:bottom w:type="dxa" w:w="70"/>
+              <w:right w:type="dxa" w:w="110"/>
+            </w:tcMar>
+          </w:tcPr>
+          <w:p>
+            <w:pPr>
+              <w:spacing w:after="0"/>
+            </w:pPr>
+            <w:r>
+              <w:rPr>
+                <w:rFonts w:ascii="Calibri" w:cs="Calibri" w:eastAsia="Calibri" w:hAnsi="Calibri"/>
+                <w:color w:val="1A1A1A"/>
+                <w:sz w:val="19"/>
+                <w:szCs w:val="19"/>
+              </w:rPr>
+              <w:t xml:space="preserve">P1</w:t>
+            </w:r>
+          </w:p>
+        </w:tc>
+        <w:tc>
+          <w:tcPr>
+            <w:tcW w:type="dxa" w:w="1217"/>
+            <w:tcMar>
+              <w:top w:type="dxa" w:w="70"/>
+              <w:left w:type="dxa" w:w="110"/>
+              <w:bottom w:type="dxa" w:w="70"/>
+              <w:right w:type="dxa" w:w="110"/>
+            </w:tcMar>
+          </w:tcPr>
+          <w:p>
+            <w:pPr>
+              <w:spacing w:after="0"/>
+            </w:pPr>
+            <w:r>
+              <w:rPr>
+                <w:rFonts w:ascii="Calibri" w:cs="Calibri" w:eastAsia="Calibri" w:hAnsi="Calibri"/>
+                <w:color w:val="1A1A1A"/>
+                <w:sz w:val="19"/>
+                <w:szCs w:val="19"/>
+              </w:rPr>
+              <w:t xml:space="preserve">Done</w:t>
+            </w:r>
+          </w:p>
+        </w:tc>
+      </w:tr>
+      <w:tr>
+        <w:tc>
+          <w:tcPr>
+            <w:tcW w:type="dxa" w:w="1123"/>
+            <w:tcMar>
+              <w:top w:type="dxa" w:w="70"/>
+              <w:left w:type="dxa" w:w="110"/>
+              <w:bottom w:type="dxa" w:w="70"/>
+              <w:right w:type="dxa" w:w="110"/>
+            </w:tcMar>
+          </w:tcPr>
+          <w:p>
+            <w:pPr>
+              <w:spacing w:after="0"/>
+            </w:pPr>
+            <w:r>
+              <w:rPr>
+                <w:rFonts w:ascii="Calibri" w:cs="Calibri" w:eastAsia="Calibri" w:hAnsi="Calibri"/>
+                <w:color w:val="1A1A1A"/>
+                <w:sz w:val="19"/>
+                <w:szCs w:val="19"/>
+              </w:rPr>
+              <w:t xml:space="preserve">FR5.6</w:t>
+            </w:r>
+          </w:p>
+        </w:tc>
+        <w:tc>
+          <w:tcPr>
+            <w:tcW w:type="dxa" w:w="5897"/>
+            <w:tcMar>
+              <w:top w:type="dxa" w:w="70"/>
+              <w:left w:type="dxa" w:w="110"/>
+              <w:bottom w:type="dxa" w:w="70"/>
+              <w:right w:type="dxa" w:w="110"/>
+            </w:tcMar>
+          </w:tcPr>
+          <w:p>
+            <w:pPr>
+              <w:spacing w:after="0"/>
+            </w:pPr>
+            <w:r>
+              <w:rPr>
+                <w:rFonts w:ascii="Calibri" w:cs="Calibri" w:eastAsia="Calibri" w:hAnsi="Calibri"/>
+                <w:color w:val="1A1A1A"/>
+                <w:sz w:val="19"/>
+                <w:szCs w:val="19"/>
+              </w:rPr>
+              <w:t xml:space="preserve">Blood banks show unit count, usable groups and opening hours</w:t>
+            </w:r>
+          </w:p>
+        </w:tc>
+        <w:tc>
+          <w:tcPr>
+            <w:tcW w:type="dxa" w:w="1123"/>
+            <w:tcMar>
+              <w:top w:type="dxa" w:w="70"/>
+              <w:left w:type="dxa" w:w="110"/>
+              <w:bottom w:type="dxa" w:w="70"/>
+              <w:right w:type="dxa" w:w="110"/>
+            </w:tcMar>
+          </w:tcPr>
+          <w:p>
+            <w:pPr>
+              <w:spacing w:after="0"/>
+            </w:pPr>
+            <w:r>
+              <w:rPr>
+                <w:rFonts w:ascii="Calibri" w:cs="Calibri" w:eastAsia="Calibri" w:hAnsi="Calibri"/>
+                <w:color w:val="1A1A1A"/>
+                <w:sz w:val="19"/>
+                <w:szCs w:val="19"/>
+              </w:rPr>
+              <w:t xml:space="preserve">P0</w:t>
+            </w:r>
+          </w:p>
+        </w:tc>
+        <w:tc>
+          <w:tcPr>
+            <w:tcW w:type="dxa" w:w="1217"/>
+            <w:tcMar>
+              <w:top w:type="dxa" w:w="70"/>
+              <w:left w:type="dxa" w:w="110"/>
+              <w:bottom w:type="dxa" w:w="70"/>
+              <w:right w:type="dxa" w:w="110"/>
+            </w:tcMar>
+          </w:tcPr>
+          <w:p>
+            <w:pPr>
+              <w:spacing w:after="0"/>
+            </w:pPr>
+            <w:r>
+              <w:rPr>
+                <w:rFonts w:ascii="Calibri" w:cs="Calibri" w:eastAsia="Calibri" w:hAnsi="Calibri"/>
+                <w:color w:val="1A1A1A"/>
+                <w:sz w:val="19"/>
+                <w:szCs w:val="19"/>
+              </w:rPr>
+              <w:t xml:space="preserve">Done</w:t>
+            </w:r>
+          </w:p>
+        </w:tc>
+      </w:tr>
+      <w:tr>
+        <w:tc>
+          <w:tcPr>
+            <w:tcW w:type="dxa" w:w="1123"/>
+            <w:tcMar>
+              <w:top w:type="dxa" w:w="70"/>
+              <w:left w:type="dxa" w:w="110"/>
+              <w:bottom w:type="dxa" w:w="70"/>
+              <w:right w:type="dxa" w:w="110"/>
+            </w:tcMar>
+          </w:tcPr>
+          <w:p>
+            <w:pPr>
+              <w:spacing w:after="0"/>
+            </w:pPr>
+            <w:r>
+              <w:rPr>
+                <w:rFonts w:ascii="Calibri" w:cs="Calibri" w:eastAsia="Calibri" w:hAnsi="Calibri"/>
+                <w:color w:val="1A1A1A"/>
+                <w:sz w:val="19"/>
+                <w:szCs w:val="19"/>
+              </w:rPr>
+              <w:t xml:space="preserve">FR5.7</w:t>
             </w:r>
           </w:p>
         </w:tc>
@@ -7371,6 +7603,83 @@
                 <w:sz w:val="19"/>
                 <w:szCs w:val="19"/>
               </w:rPr>
+              <w:t xml:space="preserve">address</w:t>
+            </w:r>
+          </w:p>
+        </w:tc>
+        <w:tc>
+          <w:tcPr>
+            <w:tcW w:type="dxa" w:w="2340"/>
+            <w:tcMar>
+              <w:top w:type="dxa" w:w="70"/>
+              <w:left w:type="dxa" w:w="110"/>
+              <w:bottom w:type="dxa" w:w="70"/>
+              <w:right w:type="dxa" w:w="110"/>
+            </w:tcMar>
+          </w:tcPr>
+          <w:p>
+            <w:pPr>
+              <w:spacing w:after="0"/>
+            </w:pPr>
+            <w:r>
+              <w:rPr>
+                <w:rFonts w:ascii="Calibri" w:cs="Calibri" w:eastAsia="Calibri" w:hAnsi="Calibri"/>
+                <w:color w:val="1A1A1A"/>
+                <w:sz w:val="19"/>
+                <w:szCs w:val="19"/>
+              </w:rPr>
+              <w:t xml:space="preserve">text</w:t>
+            </w:r>
+          </w:p>
+        </w:tc>
+        <w:tc>
+          <w:tcPr>
+            <w:tcW w:type="dxa" w:w="4212"/>
+            <w:tcMar>
+              <w:top w:type="dxa" w:w="70"/>
+              <w:left w:type="dxa" w:w="110"/>
+              <w:bottom w:type="dxa" w:w="70"/>
+              <w:right w:type="dxa" w:w="110"/>
+            </w:tcMar>
+          </w:tcPr>
+          <w:p>
+            <w:pPr>
+              <w:spacing w:after="0"/>
+            </w:pPr>
+            <w:r>
+              <w:rPr>
+                <w:rFonts w:ascii="Calibri" w:cs="Calibri" w:eastAsia="Calibri" w:hAnsi="Calibri"/>
+                <w:color w:val="1A1A1A"/>
+                <w:sz w:val="19"/>
+                <w:szCs w:val="19"/>
+              </w:rPr>
+              <w:t xml:space="preserve">Area or neighbourhood inside that city</w:t>
+            </w:r>
+          </w:p>
+        </w:tc>
+      </w:tr>
+      <w:tr>
+        <w:tc>
+          <w:tcPr>
+            <w:tcW w:type="dxa" w:w="2808"/>
+            <w:tcMar>
+              <w:top w:type="dxa" w:w="70"/>
+              <w:left w:type="dxa" w:w="110"/>
+              <w:bottom w:type="dxa" w:w="70"/>
+              <w:right w:type="dxa" w:w="110"/>
+            </w:tcMar>
+          </w:tcPr>
+          <w:p>
+            <w:pPr>
+              <w:spacing w:after="0"/>
+            </w:pPr>
+            <w:r>
+              <w:rPr>
+                <w:rFonts w:ascii="Calibri" w:cs="Calibri" w:eastAsia="Calibri" w:hAnsi="Calibri"/>
+                <w:color w:val="1A1A1A"/>
+                <w:sz w:val="19"/>
+                <w:szCs w:val="19"/>
+              </w:rPr>
               <w:t xml:space="preserve">contact</w:t>
             </w:r>
           </w:p>
@@ -7421,7 +7730,7 @@
                 <w:sz w:val="19"/>
                 <w:szCs w:val="19"/>
               </w:rPr>
-              <w:t xml:space="preserve">Phone number, hidden until the donor accepts</w:t>
+              <w:t xml:space="preserve">Phone number, shown as a tap to call link</w:t>
             </w:r>
           </w:p>
         </w:tc>
@@ -8835,6 +9144,22 @@
           <w:szCs w:val="21"/>
         </w:rPr>
         <w:t xml:space="preserve">The system uses the standard recipient to donor table. This is fixed code, not a model output.</w:t>
+      </w:r>
+    </w:p>
+    <w:p>
+      <w:pPr>
+        <w:spacing w:after="120"/>
+      </w:pPr>
+      <w:r>
+        <w:rPr>
+          <w:rFonts w:ascii="Calibri" w:cs="Calibri" w:eastAsia="Calibri" w:hAnsi="Calibri"/>
+          <w:b/>
+          <w:bCs/>
+          <w:color w:val="1A1A1A"/>
+          <w:sz w:val="21"/>
+          <w:szCs w:val="21"/>
+        </w:rPr>
+        <w:t xml:space="preserve">The table was checked line by line against the American Red Cross and the Mayo Clinic before submission. All eight entries matched with no discrepancies. The full check is in docs/compatibility_verification.md, verified by Eman Fatima on 12 September 2026.</w:t>
       </w:r>
     </w:p>
     <w:tbl>
@@ -11285,7 +11610,7 @@
                 <w:sz w:val="19"/>
                 <w:szCs w:val="19"/>
               </w:rPr>
-              <w:t xml:space="preserve">Donor phone numbers stay hidden until the donor accepts</w:t>
+              <w:t xml:space="preserve">Demo numbers only, all in a 555 block that reaches no real line</w:t>
             </w:r>
           </w:p>
         </w:tc>
@@ -15315,7 +15640,7 @@
                 <w:sz w:val="19"/>
                 <w:szCs w:val="19"/>
               </w:rPr>
-              <w:t xml:space="preserve">In progress</w:t>
+              <w:t xml:space="preserve">Done</w:t>
             </w:r>
           </w:p>
         </w:tc>

</xml_diff>